<commit_message>
Fill author details in title page and cover letter
Co-Authored-By: Claude Sonnet 5.5 <noreply@anthropic.com>
Claude-Session: https://claude.ai/code/session_01918kfW6M5XSc3gvpMMKDS3
</commit_message>
<xml_diff>
--- a/paper_data/Cover_Letter.docx
+++ b/paper_data/Cover_Letter.docx
@@ -12,7 +12,7 @@
           <w:sz w:val="24"/>
           <w:szCs w:val="24"/>
         </w:rPr>
-        <w:t xml:space="preserve">[Author name]</w:t>
+        <w:t xml:space="preserve">Ook Lee</w:t>
       </w:r>
     </w:p>
     <w:p>
@@ -25,7 +25,7 @@
           <w:sz w:val="24"/>
           <w:szCs w:val="24"/>
         </w:rPr>
-        <w:t xml:space="preserve">[Affiliation]</w:t>
+        <w:t xml:space="preserve">Department of Information Systems</w:t>
       </w:r>
     </w:p>
     <w:p>
@@ -38,7 +38,7 @@
           <w:sz w:val="24"/>
           <w:szCs w:val="24"/>
         </w:rPr>
-        <w:t xml:space="preserve">[Address]</w:t>
+        <w:t xml:space="preserve">Hanyang University, Seoul, Korea</w:t>
       </w:r>
     </w:p>
     <w:p>
@@ -51,7 +51,7 @@
           <w:sz w:val="24"/>
           <w:szCs w:val="24"/>
         </w:rPr>
-        <w:t xml:space="preserve">[E-mail]</w:t>
+        <w:t xml:space="preserve">ooklee@hanyang.ac.kr</w:t>
       </w:r>
     </w:p>
     <w:p>
@@ -157,7 +157,7 @@
           <w:sz w:val="24"/>
           <w:szCs w:val="24"/>
         </w:rPr>
-        <w:t xml:space="preserve">Software built on large language models is expected to degrade as the world drifts away from a model’s training data, and economic models of replacement say that maintainers should refresh such software once the accumulated cost of errors justifies the cost of renewal. We ask whether they do. Borrowing the distinction between state-dependent and time-dependent adjustment from the price-setting literature, we derive from a simple Poisson model of accumulating errors what each kind of rule implies for the bug-report rate and the release hazard, and we test those implications on weekly issue and release histories for 19 widely used open-source repositories (3,432 repository-weeks; 2,456 releases).</w:t>
+        <w:t xml:space="preserve">Software built on large language models is expected to degrade as the world drifts away from a model’s training data, and economic models of replacement say that maintainers should refresh such software once the accumulated cost of errors justifies the cost of renewal. I ask whether they do. Borrowing the distinction between state-dependent and time-dependent adjustment from the price-setting literature, I derive from a simple Poisson model of accumulating errors what each kind of rule implies for the bug-report rate and the release hazard, and I test those implications on weekly issue and release histories for 19 widely used open-source repositories (3,432 repository-weeks; 2,456 releases).</w:t>
       </w:r>
     </w:p>
     <w:p>
@@ -170,7 +170,7 @@
           <w:sz w:val="24"/>
           <w:szCs w:val="24"/>
         </w:rPr>
-        <w:t xml:space="preserve">We find no sign of an accumulating error state: bug reports do not rise with the time since the last release once total issue volume is controlled, and the pooled estimate rules out a 1 percent weekly increase. Only one of the 19 repositories has a release hazard that rises significantly with age, about what chance alone would produce. The raw hazard falls with age because hot-fixes cluster in the week after a release, much as temporary sales dominate raw price-change frequencies, and once hot-fixes are set apart, regular releases follow a steady cadence. Release timing in this ecosystem is therefore calendar-driven, and release frequency should not be read as evidence that degradation is being managed.</w:t>
+        <w:t xml:space="preserve">I find no sign of an accumulating error state: bug reports do not rise with the time since the last release once total issue volume is controlled, and the pooled estimate rules out a 1 percent weekly increase. Only one of the 19 repositories has a release hazard that rises significantly with age, about what chance alone would produce. The raw hazard falls with age because hot-fixes cluster in the week after a release, much as temporary sales dominate raw price-change frequencies, and once hot-fixes are set apart, regular releases follow a steady cadence. Release timing in this ecosystem is therefore calendar-driven, and release frequency should not be read as evidence that degradation is being managed.</w:t>
       </w:r>
     </w:p>
     <w:p>
@@ -183,7 +183,7 @@
           <w:sz w:val="24"/>
           <w:szCs w:val="24"/>
         </w:rPr>
-        <w:t xml:space="preserve">We believe the paper will interest your readers because it brings an established empirical test from the economics of price setting to the maintenance of AI systems, and because it speaks to the design of post-deployment monitoring obligations. We state plainly what the study does not show: the repositories are software and tooling rather than model-retraining pipelines, so a release is a proxy for a refresh, and the sample is not random.</w:t>
+        <w:t xml:space="preserve">I believe the paper will interest your readers because it brings an established empirical test from the economics of price setting to the maintenance of AI systems, and because it speaks to the design of post-deployment monitoring obligations. I state plainly what the study does not show: the repositories are software and tooling rather than model-retraining pipelines, so a release is a proxy for a refresh, and the sample is not random.</w:t>
       </w:r>
     </w:p>
     <w:p>
@@ -196,7 +196,7 @@
           <w:sz w:val="24"/>
           <w:szCs w:val="24"/>
         </w:rPr>
-        <w:t xml:space="preserve">This manuscript is original, has not been published previously, and is not under consideration for publication elsewhere. All authors have approved the submission. We have no conflicts of interest to declare [confirm]. A replication package accompanies the paper.</w:t>
+        <w:t xml:space="preserve">This manuscript is original, has not been published previously, and is not under consideration for publication elsewhere. I have no conflicts of interest to declare [confirm]. A replication package accompanies the paper.</w:t>
       </w:r>
     </w:p>
     <w:p>
@@ -235,7 +235,7 @@
           <w:sz w:val="24"/>
           <w:szCs w:val="24"/>
         </w:rPr>
-        <w:t xml:space="preserve">[Author name]</w:t>
+        <w:t xml:space="preserve">Ook Lee</w:t>
       </w:r>
     </w:p>
     <w:p>
@@ -248,7 +248,7 @@
           <w:sz w:val="24"/>
           <w:szCs w:val="24"/>
         </w:rPr>
-        <w:t xml:space="preserve">on behalf of all authors</w:t>
+        <w:t xml:space="preserve">Department of Information Systems, Hanyang University</w:t>
       </w:r>
     </w:p>
     <w:sectPr>

</xml_diff>

<commit_message>
Shorten cover letter to one page
Co-Authored-By: Claude Sonnet 5.5 <noreply@anthropic.com>
Claude-Session: https://claude.ai/code/session_01918kfW6M5XSc3gvpMMKDS3
</commit_message>
<xml_diff>
--- a/paper_data/Cover_Letter.docx
+++ b/paper_data/Cover_Letter.docx
@@ -4,249 +4,223 @@
   <w:body>
     <w:p>
       <w:pPr>
-        <w:spacing w:after="0" w:line="276"/>
-      </w:pPr>
-      <w:r>
-        <w:rPr>
-          <w:rFonts w:ascii="Times New Roman" w:cs="Times New Roman" w:eastAsia="Times New Roman" w:hAnsi="Times New Roman"/>
-          <w:sz w:val="24"/>
-          <w:szCs w:val="24"/>
+        <w:spacing w:after="0" w:line="264"/>
+      </w:pPr>
+      <w:r>
+        <w:rPr>
+          <w:rFonts w:ascii="Times New Roman" w:cs="Times New Roman" w:eastAsia="Times New Roman" w:hAnsi="Times New Roman"/>
+          <w:sz w:val="22"/>
+          <w:szCs w:val="22"/>
         </w:rPr>
         <w:t xml:space="preserve">Ook Lee</w:t>
       </w:r>
     </w:p>
     <w:p>
       <w:pPr>
-        <w:spacing w:after="0" w:line="276"/>
-      </w:pPr>
-      <w:r>
-        <w:rPr>
-          <w:rFonts w:ascii="Times New Roman" w:cs="Times New Roman" w:eastAsia="Times New Roman" w:hAnsi="Times New Roman"/>
-          <w:sz w:val="24"/>
-          <w:szCs w:val="24"/>
-        </w:rPr>
-        <w:t xml:space="preserve">Department of Information Systems</w:t>
-      </w:r>
-    </w:p>
-    <w:p>
-      <w:pPr>
-        <w:spacing w:after="0" w:line="276"/>
-      </w:pPr>
-      <w:r>
-        <w:rPr>
-          <w:rFonts w:ascii="Times New Roman" w:cs="Times New Roman" w:eastAsia="Times New Roman" w:hAnsi="Times New Roman"/>
-          <w:sz w:val="24"/>
-          <w:szCs w:val="24"/>
-        </w:rPr>
-        <w:t xml:space="preserve">Hanyang University, Seoul, Korea</w:t>
-      </w:r>
-    </w:p>
-    <w:p>
-      <w:pPr>
-        <w:spacing w:after="240" w:line="276"/>
-      </w:pPr>
-      <w:r>
-        <w:rPr>
-          <w:rFonts w:ascii="Times New Roman" w:cs="Times New Roman" w:eastAsia="Times New Roman" w:hAnsi="Times New Roman"/>
-          <w:sz w:val="24"/>
-          <w:szCs w:val="24"/>
+        <w:spacing w:after="0" w:line="264"/>
+      </w:pPr>
+      <w:r>
+        <w:rPr>
+          <w:rFonts w:ascii="Times New Roman" w:cs="Times New Roman" w:eastAsia="Times New Roman" w:hAnsi="Times New Roman"/>
+          <w:sz w:val="22"/>
+          <w:szCs w:val="22"/>
+        </w:rPr>
+        <w:t xml:space="preserve">Department of Information Systems, Hanyang University, Seoul, Korea</w:t>
+      </w:r>
+    </w:p>
+    <w:p>
+      <w:pPr>
+        <w:spacing w:after="180" w:line="264"/>
+      </w:pPr>
+      <w:r>
+        <w:rPr>
+          <w:rFonts w:ascii="Times New Roman" w:cs="Times New Roman" w:eastAsia="Times New Roman" w:hAnsi="Times New Roman"/>
+          <w:sz w:val="22"/>
+          <w:szCs w:val="22"/>
         </w:rPr>
         <w:t xml:space="preserve">ooklee@hanyang.ac.kr</w:t>
       </w:r>
     </w:p>
     <w:p>
       <w:pPr>
-        <w:spacing w:after="240" w:line="276"/>
-      </w:pPr>
-      <w:r>
-        <w:rPr>
-          <w:rFonts w:ascii="Times New Roman" w:cs="Times New Roman" w:eastAsia="Times New Roman" w:hAnsi="Times New Roman"/>
-          <w:sz w:val="24"/>
-          <w:szCs w:val="24"/>
+        <w:spacing w:after="180" w:line="264"/>
+      </w:pPr>
+      <w:r>
+        <w:rPr>
+          <w:rFonts w:ascii="Times New Roman" w:cs="Times New Roman" w:eastAsia="Times New Roman" w:hAnsi="Times New Roman"/>
+          <w:sz w:val="22"/>
+          <w:szCs w:val="22"/>
         </w:rPr>
         <w:t xml:space="preserve">12 October 2026</w:t>
       </w:r>
     </w:p>
     <w:p>
       <w:pPr>
-        <w:spacing w:after="0" w:line="276"/>
-      </w:pPr>
-      <w:r>
-        <w:rPr>
-          <w:rFonts w:ascii="Times New Roman" w:cs="Times New Roman" w:eastAsia="Times New Roman" w:hAnsi="Times New Roman"/>
-          <w:sz w:val="24"/>
-          <w:szCs w:val="24"/>
+        <w:spacing w:after="0" w:line="264"/>
+      </w:pPr>
+      <w:r>
+        <w:rPr>
+          <w:rFonts w:ascii="Times New Roman" w:cs="Times New Roman" w:eastAsia="Times New Roman" w:hAnsi="Times New Roman"/>
+          <w:sz w:val="22"/>
+          <w:szCs w:val="22"/>
         </w:rPr>
         <w:t xml:space="preserve">[Editor’s name]</w:t>
       </w:r>
     </w:p>
     <w:p>
       <w:pPr>
-        <w:spacing w:after="0" w:line="276"/>
-      </w:pPr>
-      <w:r>
-        <w:rPr>
-          <w:rFonts w:ascii="Times New Roman" w:cs="Times New Roman" w:eastAsia="Times New Roman" w:hAnsi="Times New Roman"/>
-          <w:sz w:val="24"/>
-          <w:szCs w:val="24"/>
-        </w:rPr>
-        <w:t xml:space="preserve">Editor-in-Chief</w:t>
-      </w:r>
-    </w:p>
-    <w:p>
-      <w:pPr>
-        <w:spacing w:after="240" w:line="276"/>
-      </w:pPr>
-      <w:r>
-        <w:rPr>
-          <w:rFonts w:ascii="Times New Roman" w:cs="Times New Roman" w:eastAsia="Times New Roman" w:hAnsi="Times New Roman"/>
-          <w:sz w:val="24"/>
-          <w:szCs w:val="24"/>
-        </w:rPr>
-        <w:t xml:space="preserve">[Journal name]</w:t>
-      </w:r>
-    </w:p>
-    <w:p>
-      <w:pPr>
-        <w:spacing w:after="240" w:line="276"/>
+        <w:spacing w:after="180" w:line="264"/>
+      </w:pPr>
+      <w:r>
+        <w:rPr>
+          <w:rFonts w:ascii="Times New Roman" w:cs="Times New Roman" w:eastAsia="Times New Roman" w:hAnsi="Times New Roman"/>
+          <w:sz w:val="22"/>
+          <w:szCs w:val="22"/>
+        </w:rPr>
+        <w:t xml:space="preserve">Editor-in-Chief, [Journal name]</w:t>
+      </w:r>
+    </w:p>
+    <w:p>
+      <w:pPr>
+        <w:spacing w:after="180" w:line="264"/>
       </w:pPr>
       <w:r>
         <w:rPr>
           <w:rFonts w:ascii="Times New Roman" w:cs="Times New Roman" w:eastAsia="Times New Roman" w:hAnsi="Times New Roman"/>
           <w:b/>
           <w:bCs/>
-          <w:sz w:val="24"/>
-          <w:szCs w:val="24"/>
+          <w:sz w:val="22"/>
+          <w:szCs w:val="22"/>
         </w:rPr>
         <w:t xml:space="preserve">Re: Submission of “Do Maintainers Refresh AI Software When It Degrades? Evidence from 19 LLM Repositories”</w:t>
       </w:r>
     </w:p>
     <w:p>
       <w:pPr>
-        <w:spacing w:after="200" w:line="276"/>
-      </w:pPr>
-      <w:r>
-        <w:rPr>
-          <w:rFonts w:ascii="Times New Roman" w:cs="Times New Roman" w:eastAsia="Times New Roman" w:hAnsi="Times New Roman"/>
-          <w:sz w:val="24"/>
-          <w:szCs w:val="24"/>
+        <w:spacing w:after="140" w:line="264"/>
+      </w:pPr>
+      <w:r>
+        <w:rPr>
+          <w:rFonts w:ascii="Times New Roman" w:cs="Times New Roman" w:eastAsia="Times New Roman" w:hAnsi="Times New Roman"/>
+          <w:sz w:val="22"/>
+          <w:szCs w:val="22"/>
         </w:rPr>
         <w:t xml:space="preserve">Dear [Editor’s name],</w:t>
       </w:r>
     </w:p>
     <w:p>
       <w:pPr>
-        <w:spacing w:after="200" w:line="276"/>
-      </w:pPr>
-      <w:r>
-        <w:rPr>
-          <w:rFonts w:ascii="Times New Roman" w:cs="Times New Roman" w:eastAsia="Times New Roman" w:hAnsi="Times New Roman"/>
-          <w:sz w:val="24"/>
-          <w:szCs w:val="24"/>
+        <w:spacing w:after="140" w:line="264"/>
+      </w:pPr>
+      <w:r>
+        <w:rPr>
+          <w:rFonts w:ascii="Times New Roman" w:cs="Times New Roman" w:eastAsia="Times New Roman" w:hAnsi="Times New Roman"/>
+          <w:sz w:val="22"/>
+          <w:szCs w:val="22"/>
         </w:rPr>
         <w:t xml:space="preserve">Please consider the enclosed manuscript, “Do Maintainers Refresh AI Software When It Degrades? Evidence from 19 LLM Repositories”, for publication in [Journal name].</w:t>
       </w:r>
     </w:p>
     <w:p>
       <w:pPr>
-        <w:spacing w:after="200" w:line="276"/>
-      </w:pPr>
-      <w:r>
-        <w:rPr>
-          <w:rFonts w:ascii="Times New Roman" w:cs="Times New Roman" w:eastAsia="Times New Roman" w:hAnsi="Times New Roman"/>
-          <w:sz w:val="24"/>
-          <w:szCs w:val="24"/>
-        </w:rPr>
-        <w:t xml:space="preserve">Software built on large language models is expected to degrade as the world drifts away from a model’s training data, and economic models of replacement say that maintainers should refresh such software once the accumulated cost of errors justifies the cost of renewal. I ask whether they do. Borrowing the distinction between state-dependent and time-dependent adjustment from the price-setting literature, I derive from a simple Poisson model of accumulating errors what each kind of rule implies for the bug-report rate and the release hazard, and I test those implications on weekly issue and release histories for 19 widely used open-source repositories (3,432 repository-weeks; 2,456 releases).</w:t>
-      </w:r>
-    </w:p>
-    <w:p>
-      <w:pPr>
-        <w:spacing w:after="200" w:line="276"/>
-      </w:pPr>
-      <w:r>
-        <w:rPr>
-          <w:rFonts w:ascii="Times New Roman" w:cs="Times New Roman" w:eastAsia="Times New Roman" w:hAnsi="Times New Roman"/>
-          <w:sz w:val="24"/>
-          <w:szCs w:val="24"/>
-        </w:rPr>
-        <w:t xml:space="preserve">I find no sign of an accumulating error state: bug reports do not rise with the time since the last release once total issue volume is controlled, and the pooled estimate rules out a 1 percent weekly increase. Only one of the 19 repositories has a release hazard that rises significantly with age, about what chance alone would produce. The raw hazard falls with age because hot-fixes cluster in the week after a release, much as temporary sales dominate raw price-change frequencies, and once hot-fixes are set apart, regular releases follow a steady cadence. Release timing in this ecosystem is therefore calendar-driven, and release frequency should not be read as evidence that degradation is being managed.</w:t>
-      </w:r>
-    </w:p>
-    <w:p>
-      <w:pPr>
-        <w:spacing w:after="200" w:line="276"/>
-      </w:pPr>
-      <w:r>
-        <w:rPr>
-          <w:rFonts w:ascii="Times New Roman" w:cs="Times New Roman" w:eastAsia="Times New Roman" w:hAnsi="Times New Roman"/>
-          <w:sz w:val="24"/>
-          <w:szCs w:val="24"/>
-        </w:rPr>
-        <w:t xml:space="preserve">I believe the paper will interest your readers because it brings an established empirical test from the economics of price setting to the maintenance of AI systems, and because it speaks to the design of post-deployment monitoring obligations. I state plainly what the study does not show: the repositories are software and tooling rather than model-retraining pipelines, so a release is a proxy for a refresh, and the sample is not random.</w:t>
-      </w:r>
-    </w:p>
-    <w:p>
-      <w:pPr>
-        <w:spacing w:after="200" w:line="276"/>
-      </w:pPr>
-      <w:r>
-        <w:rPr>
-          <w:rFonts w:ascii="Times New Roman" w:cs="Times New Roman" w:eastAsia="Times New Roman" w:hAnsi="Times New Roman"/>
-          <w:sz w:val="24"/>
-          <w:szCs w:val="24"/>
-        </w:rPr>
-        <w:t xml:space="preserve">This manuscript is original, has not been published previously, and is not under consideration for publication elsewhere. I have no conflicts of interest to declare [confirm]. A replication package accompanies the paper.</w:t>
-      </w:r>
-    </w:p>
-    <w:p>
-      <w:pPr>
-        <w:spacing w:after="240" w:line="276"/>
-      </w:pPr>
-      <w:r>
-        <w:rPr>
-          <w:rFonts w:ascii="Times New Roman" w:cs="Times New Roman" w:eastAsia="Times New Roman" w:hAnsi="Times New Roman"/>
-          <w:sz w:val="24"/>
-          <w:szCs w:val="24"/>
-        </w:rPr>
-        <w:t xml:space="preserve">Thank you for your time and consideration.</w:t>
-      </w:r>
-    </w:p>
-    <w:p>
-      <w:pPr>
-        <w:spacing w:after="480" w:line="276"/>
-      </w:pPr>
-      <w:r>
-        <w:rPr>
-          <w:rFonts w:ascii="Times New Roman" w:cs="Times New Roman" w:eastAsia="Times New Roman" w:hAnsi="Times New Roman"/>
-          <w:sz w:val="24"/>
-          <w:szCs w:val="24"/>
+        <w:spacing w:after="140" w:line="264"/>
+      </w:pPr>
+      <w:r>
+        <w:rPr>
+          <w:rFonts w:ascii="Times New Roman" w:cs="Times New Roman" w:eastAsia="Times New Roman" w:hAnsi="Times New Roman"/>
+          <w:sz w:val="22"/>
+          <w:szCs w:val="22"/>
+        </w:rPr>
+        <w:t xml:space="preserve">Software built on large language models is expected to degrade as the world drifts away from its training data, and economic models of replacement say that maintainers should refresh such software once accumulated errors justify the cost. I ask whether they do. Borrowing the distinction between state-dependent and time-dependent adjustment from the price-setting literature, I derive what each rule implies for the bug-report rate and the release hazard, and test those implications on weekly issue and release histories for 19 widely used open-source repositories (3,432 repository-weeks; 2,456 releases).</w:t>
+      </w:r>
+    </w:p>
+    <w:p>
+      <w:pPr>
+        <w:spacing w:after="140" w:line="264"/>
+      </w:pPr>
+      <w:r>
+        <w:rPr>
+          <w:rFonts w:ascii="Times New Roman" w:cs="Times New Roman" w:eastAsia="Times New Roman" w:hAnsi="Times New Roman"/>
+          <w:sz w:val="22"/>
+          <w:szCs w:val="22"/>
+        </w:rPr>
+        <w:t xml:space="preserve">Bug reports do not rise with the time since the last release once total issue volume is controlled, and only one of the 19 repositories has a release hazard that rises significantly with age, about what chance would produce. The raw hazard falls with age because hot-fixes cluster after a release, much as sales dominate raw price-change frequencies; once they are set apart, regular releases follow a steady cadence. Release timing is therefore calendar-driven, and release frequency should not be read as evidence that degradation is being managed.</w:t>
+      </w:r>
+    </w:p>
+    <w:p>
+      <w:pPr>
+        <w:spacing w:after="140" w:line="264"/>
+      </w:pPr>
+      <w:r>
+        <w:rPr>
+          <w:rFonts w:ascii="Times New Roman" w:cs="Times New Roman" w:eastAsia="Times New Roman" w:hAnsi="Times New Roman"/>
+          <w:sz w:val="22"/>
+          <w:szCs w:val="22"/>
+        </w:rPr>
+        <w:t xml:space="preserve">I believe the paper will interest your readers because it brings an established empirical test from the economics of price setting to the maintenance of AI systems and speaks to post-deployment monitoring obligations. I state plainly what it does not show: the repositories are software and tooling rather than model-retraining pipelines, so a release is a proxy for a refresh, and the sample is not random.</w:t>
+      </w:r>
+    </w:p>
+    <w:p>
+      <w:pPr>
+        <w:spacing w:after="140" w:line="264"/>
+      </w:pPr>
+      <w:r>
+        <w:rPr>
+          <w:rFonts w:ascii="Times New Roman" w:cs="Times New Roman" w:eastAsia="Times New Roman" w:hAnsi="Times New Roman"/>
+          <w:sz w:val="22"/>
+          <w:szCs w:val="22"/>
+        </w:rPr>
+        <w:t xml:space="preserve">This manuscript is original, has not been published previously, and is not under consideration elsewhere. I have no conflicts of interest to declare [confirm]. A replication package accompanies the paper.</w:t>
+      </w:r>
+    </w:p>
+    <w:p>
+      <w:pPr>
+        <w:spacing w:after="200" w:line="264"/>
+      </w:pPr>
+      <w:r>
+        <w:rPr>
+          <w:rFonts w:ascii="Times New Roman" w:cs="Times New Roman" w:eastAsia="Times New Roman" w:hAnsi="Times New Roman"/>
+          <w:sz w:val="22"/>
+          <w:szCs w:val="22"/>
+        </w:rPr>
+        <w:t xml:space="preserve">Thank you for your consideration.</w:t>
+      </w:r>
+    </w:p>
+    <w:p>
+      <w:pPr>
+        <w:spacing w:after="300" w:line="264"/>
+      </w:pPr>
+      <w:r>
+        <w:rPr>
+          <w:rFonts w:ascii="Times New Roman" w:cs="Times New Roman" w:eastAsia="Times New Roman" w:hAnsi="Times New Roman"/>
+          <w:sz w:val="22"/>
+          <w:szCs w:val="22"/>
         </w:rPr>
         <w:t xml:space="preserve">Sincerely,</w:t>
       </w:r>
     </w:p>
     <w:p>
       <w:pPr>
-        <w:spacing w:after="0" w:line="276"/>
-      </w:pPr>
-      <w:r>
-        <w:rPr>
-          <w:rFonts w:ascii="Times New Roman" w:cs="Times New Roman" w:eastAsia="Times New Roman" w:hAnsi="Times New Roman"/>
-          <w:sz w:val="24"/>
-          <w:szCs w:val="24"/>
+        <w:spacing w:after="0" w:line="264"/>
+      </w:pPr>
+      <w:r>
+        <w:rPr>
+          <w:rFonts w:ascii="Times New Roman" w:cs="Times New Roman" w:eastAsia="Times New Roman" w:hAnsi="Times New Roman"/>
+          <w:sz w:val="22"/>
+          <w:szCs w:val="22"/>
         </w:rPr>
         <w:t xml:space="preserve">Ook Lee</w:t>
       </w:r>
     </w:p>
     <w:p>
       <w:pPr>
-        <w:spacing w:after="0" w:line="276"/>
-      </w:pPr>
-      <w:r>
-        <w:rPr>
-          <w:rFonts w:ascii="Times New Roman" w:cs="Times New Roman" w:eastAsia="Times New Roman" w:hAnsi="Times New Roman"/>
-          <w:sz w:val="24"/>
-          <w:szCs w:val="24"/>
+        <w:spacing w:after="0" w:line="264"/>
+      </w:pPr>
+      <w:r>
+        <w:rPr>
+          <w:rFonts w:ascii="Times New Roman" w:cs="Times New Roman" w:eastAsia="Times New Roman" w:hAnsi="Times New Roman"/>
+          <w:sz w:val="22"/>
+          <w:szCs w:val="22"/>
         </w:rPr>
         <w:t xml:space="preserve">Department of Information Systems, Hanyang University</w:t>
       </w:r>
@@ -440,8 +414,8 @@
     <w:rPrDefault>
       <w:rPr>
         <w:rFonts w:ascii="Times New Roman" w:cs="Times New Roman" w:eastAsia="Times New Roman" w:hAnsi="Times New Roman"/>
-        <w:sz w:val="24"/>
-        <w:szCs w:val="24"/>
+        <w:sz w:val="22"/>
+        <w:szCs w:val="22"/>
       </w:rPr>
     </w:rPrDefault>
     <w:pPrDefault/>

</xml_diff>

<commit_message>
Correct department name to Information System
Co-Authored-By: Claude Sonnet 5.5 <noreply@anthropic.com>
Claude-Session: https://claude.ai/code/session_01918kfW6M5XSc3gvpMMKDS3
</commit_message>
<xml_diff>
--- a/paper_data/Cover_Letter.docx
+++ b/paper_data/Cover_Letter.docx
@@ -25,7 +25,7 @@
           <w:sz w:val="22"/>
           <w:szCs w:val="22"/>
         </w:rPr>
-        <w:t xml:space="preserve">Department of Information Systems, Hanyang University, Seoul, Korea</w:t>
+        <w:t xml:space="preserve">Department of Information System, Hanyang University, Seoul, Korea</w:t>
       </w:r>
     </w:p>
     <w:p>
@@ -222,7 +222,7 @@
           <w:sz w:val="22"/>
           <w:szCs w:val="22"/>
         </w:rPr>
-        <w:t xml:space="preserve">Department of Information Systems, Hanyang University</w:t>
+        <w:t xml:space="preserve">Department of Information System, Hanyang University</w:t>
       </w:r>
     </w:p>
     <w:sectPr>

</xml_diff>

<commit_message>
Address cover letter to Information Economics and Policy
Co-Authored-By: Claude Sonnet 5.5 <noreply@anthropic.com>
Claude-Session: https://claude.ai/code/session_01918kfW6M5XSc3gvpMMKDS3
</commit_message>
<xml_diff>
--- a/paper_data/Cover_Letter.docx
+++ b/paper_data/Cover_Letter.docx
@@ -64,7 +64,7 @@
           <w:sz w:val="22"/>
           <w:szCs w:val="22"/>
         </w:rPr>
-        <w:t xml:space="preserve">[Editor’s name]</w:t>
+        <w:t xml:space="preserve">The Editors</w:t>
       </w:r>
     </w:p>
     <w:p>
@@ -77,7 +77,7 @@
           <w:sz w:val="22"/>
           <w:szCs w:val="22"/>
         </w:rPr>
-        <w:t xml:space="preserve">Editor-in-Chief, [Journal name]</w:t>
+        <w:t xml:space="preserve">Information Economics and Policy</w:t>
       </w:r>
     </w:p>
     <w:p>
@@ -105,7 +105,7 @@
           <w:sz w:val="22"/>
           <w:szCs w:val="22"/>
         </w:rPr>
-        <w:t xml:space="preserve">Dear [Editor’s name],</w:t>
+        <w:t xml:space="preserve">Dear Editor,</w:t>
       </w:r>
     </w:p>
     <w:p>
@@ -118,7 +118,7 @@
           <w:sz w:val="22"/>
           <w:szCs w:val="22"/>
         </w:rPr>
-        <w:t xml:space="preserve">Please consider the enclosed manuscript, “Do Maintainers Refresh AI Software When It Degrades? Evidence from 19 LLM Repositories”, for publication in [Journal name].</w:t>
+        <w:t xml:space="preserve">Please consider the enclosed manuscript, “Do Maintainers Refresh AI Software When It Degrades? Evidence from 19 LLM Repositories”, for publication in Information Economics and Policy.</w:t>
       </w:r>
     </w:p>
     <w:p>

</xml_diff>